<commit_message>
Docs: documentatie tehnica sesiunea 5 Bloc E + v2 actualizata
- docs/sesiuni/sesiune-5-bloc-e.docx + .pdf (8 sectiuni: M10/M11/M12, WCAG, Tailwind4, deploy)
- docs/documentatie-tehnica-v2.docx + .pdf actualizat cu sesiunile S3 si S5 Bloc E
- scripts/gen-documentatie-sesiune5.mjs — script generator nou pentru sesiunea 5
- scripts/gen-documentatie-tehnica-v2.mjs — actualizat cu S5, data editie finala

Co-Authored-By: Claude <noreply@anthropic.com>
</commit_message>
<xml_diff>
--- a/docs/documentatie-tehnica-v2.docx
+++ b/docs/documentatie-tehnica-v2.docx
@@ -102,7 +102,7 @@
           <w:sz w:val="24"/>
           <w:szCs w:val="24"/>
         </w:rPr>
-        <w:t xml:space="preserve">2026-04-04 (actualizat sesiunea 2)</w:t>
+        <w:t xml:space="preserve">2026-04-04 (editia finala — Sesiunea 5 Bloc E)</w:t>
       </w:r>
     </w:p>
     <w:p>
@@ -10769,6 +10769,776 @@
     </w:tbl>
     <w:p>
       <w:pPr>
+        <w:spacing w:after="100"/>
+      </w:pPr>
+    </w:p>
+    <w:p>
+      <w:pPr>
+        <w:pStyle w:val="Heading2"/>
+        <w:spacing w:after="160" w:before="320"/>
+      </w:pPr>
+      <w:r>
+        <w:rPr>
+          <w:b/>
+          <w:bCs/>
+          <w:color w:val="1F2937"/>
+          <w:sz w:val="26"/>
+          <w:szCs w:val="26"/>
+        </w:rPr>
+        <w:t xml:space="preserve">Sesiunea 2026-04-04 S3 — UX polish + Admin controls</w:t>
+      </w:r>
+    </w:p>
+    <w:tbl>
+      <w:tblPr>
+        <w:tblW w:type="pct" w:w="100%"/>
+        <w:tblBorders>
+          <w:top w:val="single" w:color="auto" w:sz="4"/>
+          <w:left w:val="single" w:color="auto" w:sz="4"/>
+          <w:bottom w:val="single" w:color="auto" w:sz="4"/>
+          <w:right w:val="single" w:color="auto" w:sz="4"/>
+          <w:insideH w:val="single" w:color="auto" w:sz="4"/>
+          <w:insideV w:val="single" w:color="auto" w:sz="4"/>
+        </w:tblBorders>
+      </w:tblPr>
+      <w:tblGrid>
+        <w:gridCol w:w="100"/>
+        <w:gridCol w:w="100"/>
+        <w:gridCol w:w="100"/>
+      </w:tblGrid>
+      <w:tr>
+        <w:trPr>
+          <w:tblHeader/>
+        </w:trPr>
+        <w:tc>
+          <w:tcPr>
+            <w:tcW w:type="pct" w:w="33%"/>
+            <w:shd w:color="0D9488" w:val="solid"/>
+            <w:vAlign w:val="center"/>
+          </w:tcPr>
+          <w:p>
+            <w:r>
+              <w:rPr>
+                <w:b/>
+                <w:bCs/>
+                <w:color w:val="FFFFFF"/>
+                <w:sz w:val="20"/>
+                <w:szCs w:val="20"/>
+              </w:rPr>
+              <w:t xml:space="preserve">Task</w:t>
+            </w:r>
+          </w:p>
+        </w:tc>
+        <w:tc>
+          <w:tcPr>
+            <w:tcW w:type="pct" w:w="33%"/>
+            <w:shd w:color="0D9488" w:val="solid"/>
+            <w:vAlign w:val="center"/>
+          </w:tcPr>
+          <w:p>
+            <w:r>
+              <w:rPr>
+                <w:b/>
+                <w:bCs/>
+                <w:color w:val="FFFFFF"/>
+                <w:sz w:val="20"/>
+                <w:szCs w:val="20"/>
+              </w:rPr>
+              <w:t xml:space="preserve">Descriere</w:t>
+            </w:r>
+          </w:p>
+        </w:tc>
+        <w:tc>
+          <w:tcPr>
+            <w:tcW w:type="pct" w:w="33%"/>
+            <w:shd w:color="0D9488" w:val="solid"/>
+            <w:vAlign w:val="center"/>
+          </w:tcPr>
+          <w:p>
+            <w:r>
+              <w:rPr>
+                <w:b/>
+                <w:bCs/>
+                <w:color w:val="FFFFFF"/>
+                <w:sz w:val="20"/>
+                <w:szCs w:val="20"/>
+              </w:rPr>
+              <w:t xml:space="preserve">Commit</w:t>
+            </w:r>
+          </w:p>
+        </w:tc>
+      </w:tr>
+      <w:tr>
+        <w:tc>
+          <w:tcPr>
+            <w:tcW w:type="pct" w:w="33%"/>
+            <w:shd w:color="F0FDFA" w:val="solid"/>
+            <w:vAlign w:val="center"/>
+          </w:tcPr>
+          <w:p>
+            <w:r>
+              <w:rPr>
+                <w:color w:val="1F2937"/>
+                <w:sz w:val="19"/>
+                <w:szCs w:val="19"/>
+              </w:rPr>
+              <w:t xml:space="preserve">Preloader</w:t>
+            </w:r>
+          </w:p>
+        </w:tc>
+        <w:tc>
+          <w:tcPr>
+            <w:tcW w:type="pct" w:w="33%"/>
+            <w:shd w:color="F0FDFA" w:val="solid"/>
+            <w:vAlign w:val="center"/>
+          </w:tcPr>
+          <w:p>
+            <w:r>
+              <w:rPr>
+                <w:color w:val="1F2937"/>
+                <w:sz w:val="19"/>
+                <w:szCs w:val="19"/>
+              </w:rPr>
+              <w:t xml:space="preserve">Sters textul "Se prepara cafeaua...", animatia cupei ramane</w:t>
+            </w:r>
+          </w:p>
+        </w:tc>
+        <w:tc>
+          <w:tcPr>
+            <w:tcW w:type="pct" w:w="33%"/>
+            <w:shd w:color="F0FDFA" w:val="solid"/>
+            <w:vAlign w:val="center"/>
+          </w:tcPr>
+          <w:p>
+            <w:r>
+              <w:rPr>
+                <w:color w:val="1F2937"/>
+                <w:sz w:val="19"/>
+                <w:szCs w:val="19"/>
+              </w:rPr>
+              <w:t xml:space="preserve">953eaed</w:t>
+            </w:r>
+          </w:p>
+        </w:tc>
+      </w:tr>
+      <w:tr>
+        <w:tc>
+          <w:tcPr>
+            <w:tcW w:type="pct" w:w="33%"/>
+            <w:vAlign w:val="center"/>
+          </w:tcPr>
+          <w:p>
+            <w:r>
+              <w:rPr>
+                <w:color w:val="1F2937"/>
+                <w:sz w:val="19"/>
+                <w:szCs w:val="19"/>
+              </w:rPr>
+              <w:t xml:space="preserve">/sarbatori</w:t>
+            </w:r>
+          </w:p>
+        </w:tc>
+        <w:tc>
+          <w:tcPr>
+            <w:tcW w:type="pct" w:w="33%"/>
+            <w:vAlign w:val="center"/>
+          </w:tcPr>
+          <w:p>
+            <w:r>
+              <w:rPr>
+                <w:color w:val="1F2937"/>
+                <w:sz w:val="19"/>
+                <w:szCs w:val="19"/>
+              </w:rPr>
+              <w:t xml:space="preserve">Rescrisa cu date live Supabase: holiday_config + menu_items cu preturi reduse</w:t>
+            </w:r>
+          </w:p>
+        </w:tc>
+        <w:tc>
+          <w:tcPr>
+            <w:tcW w:type="pct" w:w="33%"/>
+            <w:vAlign w:val="center"/>
+          </w:tcPr>
+          <w:p>
+            <w:r>
+              <w:rPr>
+                <w:color w:val="1F2937"/>
+                <w:sz w:val="19"/>
+                <w:szCs w:val="19"/>
+              </w:rPr>
+              <w:t xml:space="preserve">953eaed</w:t>
+            </w:r>
+          </w:p>
+        </w:tc>
+      </w:tr>
+      <w:tr>
+        <w:tc>
+          <w:tcPr>
+            <w:tcW w:type="pct" w:w="33%"/>
+            <w:shd w:color="F0FDFA" w:val="solid"/>
+            <w:vAlign w:val="center"/>
+          </w:tcPr>
+          <w:p>
+            <w:r>
+              <w:rPr>
+                <w:color w:val="1F2937"/>
+                <w:sz w:val="19"/>
+                <w:szCs w:val="19"/>
+              </w:rPr>
+              <w:t xml:space="preserve">menu-settings API</w:t>
+            </w:r>
+          </w:p>
+        </w:tc>
+        <w:tc>
+          <w:tcPr>
+            <w:tcW w:type="pct" w:w="33%"/>
+            <w:shd w:color="F0FDFA" w:val="solid"/>
+            <w:vAlign w:val="center"/>
+          </w:tcPr>
+          <w:p>
+            <w:r>
+              <w:rPr>
+                <w:color w:val="1F2937"/>
+                <w:sz w:val="19"/>
+                <w:szCs w:val="19"/>
+              </w:rPr>
+              <w:t xml:space="preserve">Endpoint nou GET/PATCH pentru toggleuri de afisare meniu</w:t>
+            </w:r>
+          </w:p>
+        </w:tc>
+        <w:tc>
+          <w:tcPr>
+            <w:tcW w:type="pct" w:w="33%"/>
+            <w:shd w:color="F0FDFA" w:val="solid"/>
+            <w:vAlign w:val="center"/>
+          </w:tcPr>
+          <w:p>
+            <w:r>
+              <w:rPr>
+                <w:color w:val="1F2937"/>
+                <w:sz w:val="19"/>
+                <w:szCs w:val="19"/>
+              </w:rPr>
+              <w:t xml:space="preserve">5f41cea</w:t>
+            </w:r>
+          </w:p>
+        </w:tc>
+      </w:tr>
+      <w:tr>
+        <w:tc>
+          <w:tcPr>
+            <w:tcW w:type="pct" w:w="33%"/>
+            <w:vAlign w:val="center"/>
+          </w:tcPr>
+          <w:p>
+            <w:r>
+              <w:rPr>
+                <w:color w:val="1F2937"/>
+                <w:sz w:val="19"/>
+                <w:szCs w:val="19"/>
+              </w:rPr>
+              <w:t xml:space="preserve">Admin Setari</w:t>
+            </w:r>
+          </w:p>
+        </w:tc>
+        <w:tc>
+          <w:tcPr>
+            <w:tcW w:type="pct" w:w="33%"/>
+            <w:vAlign w:val="center"/>
+          </w:tcPr>
+          <w:p>
+            <w:r>
+              <w:rPr>
+                <w:color w:val="1F2937"/>
+                <w:sz w:val="19"/>
+                <w:szCs w:val="19"/>
+              </w:rPr>
+              <w:t xml:space="preserve">Toggle valuta (RON/EUR/USD) + toggle coloane — controleaza /meniu</w:t>
+            </w:r>
+          </w:p>
+        </w:tc>
+        <w:tc>
+          <w:tcPr>
+            <w:tcW w:type="pct" w:w="33%"/>
+            <w:vAlign w:val="center"/>
+          </w:tcPr>
+          <w:p>
+            <w:r>
+              <w:rPr>
+                <w:color w:val="1F2937"/>
+                <w:sz w:val="19"/>
+                <w:szCs w:val="19"/>
+              </w:rPr>
+              <w:t xml:space="preserve">5f41cea</w:t>
+            </w:r>
+          </w:p>
+        </w:tc>
+      </w:tr>
+      <w:tr>
+        <w:tc>
+          <w:tcPr>
+            <w:tcW w:type="pct" w:w="33%"/>
+            <w:shd w:color="F0FDFA" w:val="solid"/>
+            <w:vAlign w:val="center"/>
+          </w:tcPr>
+          <w:p>
+            <w:r>
+              <w:rPr>
+                <w:color w:val="1F2937"/>
+                <w:sz w:val="19"/>
+                <w:szCs w:val="19"/>
+              </w:rPr>
+              <w:t xml:space="preserve">Copywriting</w:t>
+            </w:r>
+          </w:p>
+        </w:tc>
+        <w:tc>
+          <w:tcPr>
+            <w:tcW w:type="pct" w:w="33%"/>
+            <w:shd w:color="F0FDFA" w:val="solid"/>
+            <w:vAlign w:val="center"/>
+          </w:tcPr>
+          <w:p>
+            <w:r>
+              <w:rPr>
+                <w:color w:val="1F2937"/>
+                <w:sz w:val="19"/>
+                <w:szCs w:val="19"/>
+              </w:rPr>
+              <w:t xml:space="preserve">"brunch" eliminat din toate formularile → "Cafea buna. Oameni buni. Un loc al tau."</w:t>
+            </w:r>
+          </w:p>
+        </w:tc>
+        <w:tc>
+          <w:tcPr>
+            <w:tcW w:type="pct" w:w="33%"/>
+            <w:shd w:color="F0FDFA" w:val="solid"/>
+            <w:vAlign w:val="center"/>
+          </w:tcPr>
+          <w:p>
+            <w:r>
+              <w:rPr>
+                <w:color w:val="1F2937"/>
+                <w:sz w:val="19"/>
+                <w:szCs w:val="19"/>
+              </w:rPr>
+              <w:t xml:space="preserve">5f41cea</w:t>
+            </w:r>
+          </w:p>
+        </w:tc>
+      </w:tr>
+      <w:tr>
+        <w:tc>
+          <w:tcPr>
+            <w:tcW w:type="pct" w:w="33%"/>
+            <w:vAlign w:val="center"/>
+          </w:tcPr>
+          <w:p>
+            <w:r>
+              <w:rPr>
+                <w:color w:val="1F2937"/>
+                <w:sz w:val="19"/>
+                <w:szCs w:val="19"/>
+              </w:rPr>
+              <w:t xml:space="preserve">ScrollAnimations</w:t>
+            </w:r>
+          </w:p>
+        </w:tc>
+        <w:tc>
+          <w:tcPr>
+            <w:tcW w:type="pct" w:w="33%"/>
+            <w:vAlign w:val="center"/>
+          </w:tcPr>
+          <w:p>
+            <w:r>
+              <w:rPr>
+                <w:color w:val="1F2937"/>
+                <w:sz w:val="19"/>
+                <w:szCs w:val="19"/>
+              </w:rPr>
+              <w:t xml:space="preserve">Intersection Observer scroll + contor animat rating (4.9) si recenzii (340+)</w:t>
+            </w:r>
+          </w:p>
+        </w:tc>
+        <w:tc>
+          <w:tcPr>
+            <w:tcW w:type="pct" w:w="33%"/>
+            <w:vAlign w:val="center"/>
+          </w:tcPr>
+          <w:p>
+            <w:r>
+              <w:rPr>
+                <w:color w:val="1F2937"/>
+                <w:sz w:val="19"/>
+                <w:szCs w:val="19"/>
+              </w:rPr>
+              <w:t xml:space="preserve">c9f0fe0</w:t>
+            </w:r>
+          </w:p>
+        </w:tc>
+      </w:tr>
+    </w:tbl>
+    <w:p>
+      <w:pPr>
+        <w:spacing w:after="100"/>
+      </w:pPr>
+    </w:p>
+    <w:p>
+      <w:pPr>
+        <w:pStyle w:val="Heading2"/>
+        <w:spacing w:after="160" w:before="320"/>
+      </w:pPr>
+      <w:r>
+        <w:rPr>
+          <w:b/>
+          <w:bCs/>
+          <w:color w:val="1F2937"/>
+          <w:sz w:val="26"/>
+          <w:szCs w:val="26"/>
+        </w:rPr>
+        <w:t xml:space="preserve">Sesiunea 2026-04-04 S5 Bloc E — Redesign Vizual</w:t>
+      </w:r>
+    </w:p>
+    <w:tbl>
+      <w:tblPr>
+        <w:tblW w:type="pct" w:w="100%"/>
+        <w:tblBorders>
+          <w:top w:val="single" w:color="auto" w:sz="4"/>
+          <w:left w:val="single" w:color="auto" w:sz="4"/>
+          <w:bottom w:val="single" w:color="auto" w:sz="4"/>
+          <w:right w:val="single" w:color="auto" w:sz="4"/>
+          <w:insideH w:val="single" w:color="auto" w:sz="4"/>
+          <w:insideV w:val="single" w:color="auto" w:sz="4"/>
+        </w:tblBorders>
+      </w:tblPr>
+      <w:tblGrid>
+        <w:gridCol w:w="100"/>
+        <w:gridCol w:w="100"/>
+        <w:gridCol w:w="100"/>
+      </w:tblGrid>
+      <w:tr>
+        <w:trPr>
+          <w:tblHeader/>
+        </w:trPr>
+        <w:tc>
+          <w:tcPr>
+            <w:tcW w:type="pct" w:w="33%"/>
+            <w:shd w:color="0D9488" w:val="solid"/>
+            <w:vAlign w:val="center"/>
+          </w:tcPr>
+          <w:p>
+            <w:r>
+              <w:rPr>
+                <w:b/>
+                <w:bCs/>
+                <w:color w:val="FFFFFF"/>
+                <w:sz w:val="20"/>
+                <w:szCs w:val="20"/>
+              </w:rPr>
+              <w:t xml:space="preserve">Modificare</w:t>
+            </w:r>
+          </w:p>
+        </w:tc>
+        <w:tc>
+          <w:tcPr>
+            <w:tcW w:type="pct" w:w="33%"/>
+            <w:shd w:color="0D9488" w:val="solid"/>
+            <w:vAlign w:val="center"/>
+          </w:tcPr>
+          <w:p>
+            <w:r>
+              <w:rPr>
+                <w:b/>
+                <w:bCs/>
+                <w:color w:val="FFFFFF"/>
+                <w:sz w:val="20"/>
+                <w:szCs w:val="20"/>
+              </w:rPr>
+              <w:t xml:space="preserve">Descriere</w:t>
+            </w:r>
+          </w:p>
+        </w:tc>
+        <w:tc>
+          <w:tcPr>
+            <w:tcW w:type="pct" w:w="33%"/>
+            <w:shd w:color="0D9488" w:val="solid"/>
+            <w:vAlign w:val="center"/>
+          </w:tcPr>
+          <w:p>
+            <w:r>
+              <w:rPr>
+                <w:b/>
+                <w:bCs/>
+                <w:color w:val="FFFFFF"/>
+                <w:sz w:val="20"/>
+                <w:szCs w:val="20"/>
+              </w:rPr>
+              <w:t xml:space="preserve">Commit</w:t>
+            </w:r>
+          </w:p>
+        </w:tc>
+      </w:tr>
+      <w:tr>
+        <w:tc>
+          <w:tcPr>
+            <w:tcW w:type="pct" w:w="33%"/>
+            <w:shd w:color="F0FDFA" w:val="solid"/>
+            <w:vAlign w:val="center"/>
+          </w:tcPr>
+          <w:p>
+            <w:r>
+              <w:rPr>
+                <w:color w:val="1F2937"/>
+                <w:sz w:val="19"/>
+                <w:szCs w:val="19"/>
+              </w:rPr>
+              <w:t xml:space="preserve">M10</w:t>
+            </w:r>
+          </w:p>
+        </w:tc>
+        <w:tc>
+          <w:tcPr>
+            <w:tcW w:type="pct" w:w="33%"/>
+            <w:shd w:color="F0FDFA" w:val="solid"/>
+            <w:vAlign w:val="center"/>
+          </w:tcPr>
+          <w:p>
+            <w:r>
+              <w:rPr>
+                <w:color w:val="1F2937"/>
+                <w:sz w:val="19"/>
+                <w:szCs w:val="19"/>
+              </w:rPr>
+              <w:t xml:space="preserve">Stepper vizual 3 pasi pe /rezervari: Data+Ora → Detalii → Confirmare</w:t>
+            </w:r>
+          </w:p>
+        </w:tc>
+        <w:tc>
+          <w:tcPr>
+            <w:tcW w:type="pct" w:w="33%"/>
+            <w:shd w:color="F0FDFA" w:val="solid"/>
+            <w:vAlign w:val="center"/>
+          </w:tcPr>
+          <w:p>
+            <w:r>
+              <w:rPr>
+                <w:color w:val="1F2937"/>
+                <w:sz w:val="19"/>
+                <w:szCs w:val="19"/>
+              </w:rPr>
+              <w:t xml:space="preserve">5a6ec11</w:t>
+            </w:r>
+          </w:p>
+        </w:tc>
+      </w:tr>
+      <w:tr>
+        <w:tc>
+          <w:tcPr>
+            <w:tcW w:type="pct" w:w="33%"/>
+            <w:vAlign w:val="center"/>
+          </w:tcPr>
+          <w:p>
+            <w:r>
+              <w:rPr>
+                <w:color w:val="1F2937"/>
+                <w:sz w:val="19"/>
+                <w:szCs w:val="19"/>
+              </w:rPr>
+              <w:t xml:space="preserve">M11</w:t>
+            </w:r>
+          </w:p>
+        </w:tc>
+        <w:tc>
+          <w:tcPr>
+            <w:tcW w:type="pct" w:w="33%"/>
+            <w:vAlign w:val="center"/>
+          </w:tcPr>
+          <w:p>
+            <w:r>
+              <w:rPr>
+                <w:color w:val="1F2937"/>
+                <w:sz w:val="19"/>
+                <w:szCs w:val="19"/>
+              </w:rPr>
+              <w:t xml:space="preserve">Contrast WCAG AA: text-gray-400 → text-gray-300 in footer (bg-gray-800)</w:t>
+            </w:r>
+          </w:p>
+        </w:tc>
+        <w:tc>
+          <w:tcPr>
+            <w:tcW w:type="pct" w:w="33%"/>
+            <w:vAlign w:val="center"/>
+          </w:tcPr>
+          <w:p>
+            <w:r>
+              <w:rPr>
+                <w:color w:val="1F2937"/>
+                <w:sz w:val="19"/>
+                <w:szCs w:val="19"/>
+              </w:rPr>
+              <w:t xml:space="preserve">5a6ec11</w:t>
+            </w:r>
+          </w:p>
+        </w:tc>
+      </w:tr>
+      <w:tr>
+        <w:tc>
+          <w:tcPr>
+            <w:tcW w:type="pct" w:w="33%"/>
+            <w:shd w:color="F0FDFA" w:val="solid"/>
+            <w:vAlign w:val="center"/>
+          </w:tcPr>
+          <w:p>
+            <w:r>
+              <w:rPr>
+                <w:color w:val="1F2937"/>
+                <w:sz w:val="19"/>
+                <w:szCs w:val="19"/>
+              </w:rPr>
+              <w:t xml:space="preserve">M12 P1</w:t>
+            </w:r>
+          </w:p>
+        </w:tc>
+        <w:tc>
+          <w:tcPr>
+            <w:tcW w:type="pct" w:w="33%"/>
+            <w:shd w:color="F0FDFA" w:val="solid"/>
+            <w:vAlign w:val="center"/>
+          </w:tcPr>
+          <w:p>
+            <w:r>
+              <w:rPr>
+                <w:color w:val="1F2937"/>
+                <w:sz w:val="19"/>
+                <w:szCs w:val="19"/>
+              </w:rPr>
+              <w:t xml:space="preserve">Font Playfair Display via next/font/google, variabila --font-playfair pe h1/h2</w:t>
+            </w:r>
+          </w:p>
+        </w:tc>
+        <w:tc>
+          <w:tcPr>
+            <w:tcW w:type="pct" w:w="33%"/>
+            <w:shd w:color="F0FDFA" w:val="solid"/>
+            <w:vAlign w:val="center"/>
+          </w:tcPr>
+          <w:p>
+            <w:r>
+              <w:rPr>
+                <w:color w:val="1F2937"/>
+                <w:sz w:val="19"/>
+                <w:szCs w:val="19"/>
+              </w:rPr>
+              <w:t xml:space="preserve">5a6ec11</w:t>
+            </w:r>
+          </w:p>
+        </w:tc>
+      </w:tr>
+      <w:tr>
+        <w:tc>
+          <w:tcPr>
+            <w:tcW w:type="pct" w:w="33%"/>
+            <w:vAlign w:val="center"/>
+          </w:tcPr>
+          <w:p>
+            <w:r>
+              <w:rPr>
+                <w:color w:val="1F2937"/>
+                <w:sz w:val="19"/>
+                <w:szCs w:val="19"/>
+              </w:rPr>
+              <w:t xml:space="preserve">M12 P2</w:t>
+            </w:r>
+          </w:p>
+        </w:tc>
+        <w:tc>
+          <w:tcPr>
+            <w:tcW w:type="pct" w:w="33%"/>
+            <w:vAlign w:val="center"/>
+          </w:tcPr>
+          <w:p>
+            <w:r>
+              <w:rPr>
+                <w:color w:val="1F2937"/>
+                <w:sz w:val="19"/>
+                <w:szCs w:val="19"/>
+              </w:rPr>
+              <w:t xml:space="preserve">Paleta espresso/crem/oliv in @theme inline CSS (Tailwind 4 — fara tailwind.config.ts)</w:t>
+            </w:r>
+          </w:p>
+        </w:tc>
+        <w:tc>
+          <w:tcPr>
+            <w:tcW w:type="pct" w:w="33%"/>
+            <w:vAlign w:val="center"/>
+          </w:tcPr>
+          <w:p>
+            <w:r>
+              <w:rPr>
+                <w:color w:val="1F2937"/>
+                <w:sz w:val="19"/>
+                <w:szCs w:val="19"/>
+              </w:rPr>
+              <w:t xml:space="preserve">5a6ec11</w:t>
+            </w:r>
+          </w:p>
+        </w:tc>
+      </w:tr>
+      <w:tr>
+        <w:tc>
+          <w:tcPr>
+            <w:tcW w:type="pct" w:w="33%"/>
+            <w:shd w:color="F0FDFA" w:val="solid"/>
+            <w:vAlign w:val="center"/>
+          </w:tcPr>
+          <w:p>
+            <w:r>
+              <w:rPr>
+                <w:color w:val="1F2937"/>
+                <w:sz w:val="19"/>
+                <w:szCs w:val="19"/>
+              </w:rPr>
+              <w:t xml:space="preserve">M12 P3</w:t>
+            </w:r>
+          </w:p>
+        </w:tc>
+        <w:tc>
+          <w:tcPr>
+            <w:tcW w:type="pct" w:w="33%"/>
+            <w:shd w:color="F0FDFA" w:val="solid"/>
+            <w:vAlign w:val="center"/>
+          </w:tcPr>
+          <w:p>
+            <w:r>
+              <w:rPr>
+                <w:color w:val="1F2937"/>
+                <w:sz w:val="19"/>
+                <w:szCs w:val="19"/>
+              </w:rPr>
+              <w:t xml:space="preserve">Butoane CTA homepage: teal → espresso-800, orange → oliv-600</w:t>
+            </w:r>
+          </w:p>
+        </w:tc>
+        <w:tc>
+          <w:tcPr>
+            <w:tcW w:type="pct" w:w="33%"/>
+            <w:shd w:color="F0FDFA" w:val="solid"/>
+            <w:vAlign w:val="center"/>
+          </w:tcPr>
+          <w:p>
+            <w:r>
+              <w:rPr>
+                <w:color w:val="1F2937"/>
+                <w:sz w:val="19"/>
+                <w:szCs w:val="19"/>
+              </w:rPr>
+              <w:t xml:space="preserve">5a6ec11</w:t>
+            </w:r>
+          </w:p>
+        </w:tc>
+      </w:tr>
+    </w:tbl>
+    <w:p>
+      <w:pPr>
         <w:pStyle w:val="Heading1"/>
         <w:pageBreakBefore/>
         <w:pBdr>
@@ -10925,6 +11695,112 @@
           <w:szCs w:val="22"/>
         </w:rPr>
         <w:t xml:space="preserve">Testimonialele sunt date statice — nu se schimba cu interactiunea utilizatorului. Un Server Component inseamna ca datele sunt in HTML-ul initial (crawlat de Google) si nu necesita JS pe client (performanta mai buna).</w:t>
+      </w:r>
+    </w:p>
+    <w:p>
+      <w:pPr>
+        <w:pStyle w:val="Heading2"/>
+        <w:spacing w:after="160" w:before="320"/>
+      </w:pPr>
+      <w:r>
+        <w:rPr>
+          <w:b/>
+          <w:bCs/>
+          <w:color w:val="1F2937"/>
+          <w:sz w:val="26"/>
+          <w:szCs w:val="26"/>
+        </w:rPr>
+        <w:t xml:space="preserve">12.6 De ce culorile custom sunt in globals.css si nu in tailwind.config.ts? (Tailwind 4)</w:t>
+      </w:r>
+    </w:p>
+    <w:p>
+      <w:pPr>
+        <w:spacing w:after="140"/>
+      </w:pPr>
+      <w:r>
+        <w:rPr>
+          <w:sz w:val="22"/>
+          <w:szCs w:val="22"/>
+        </w:rPr>
+        <w:t xml:space="preserve">Tailwind CSS 4 a eliminat fisierul tailwind.config.js/ts. Configurarea temei (culori, fonturi, spatieri) se face acum direct in CSS prin directiva @theme inline. Aceasta abordare elimina un nivel de abstractie si face configurarea mai transparenta — CSS ramane singura sursa de adevar pentru design tokens.</w:t>
+      </w:r>
+    </w:p>
+    <w:p>
+      <w:pPr>
+        <w:pBdr>
+          <w:left w:val="single" w:color="14B8A6" w:sz="6"/>
+        </w:pBdr>
+        <w:shd w:color="F0FDFA" w:val="solid"/>
+        <w:spacing w:after="60"/>
+        <w:ind w:left="400" w:right="400"/>
+      </w:pPr>
+      <w:r>
+        <w:rPr>
+          <w:rFonts w:ascii="Courier New" w:cs="Courier New" w:eastAsia="Courier New" w:hAnsi="Courier New"/>
+          <w:color w:val="0D9488"/>
+          <w:sz w:val="18"/>
+          <w:szCs w:val="18"/>
+        </w:rPr>
+        <w:t xml:space="preserve">/* Tailwind 4 — globals.css */</w:t>
+      </w:r>
+    </w:p>
+    <w:p>
+      <w:pPr>
+        <w:pBdr>
+          <w:left w:val="single" w:color="14B8A6" w:sz="6"/>
+        </w:pBdr>
+        <w:shd w:color="F0FDFA" w:val="solid"/>
+        <w:spacing w:after="60"/>
+        <w:ind w:left="400" w:right="400"/>
+      </w:pPr>
+      <w:r>
+        <w:rPr>
+          <w:rFonts w:ascii="Courier New" w:cs="Courier New" w:eastAsia="Courier New" w:hAnsi="Courier New"/>
+          <w:color w:val="0D9488"/>
+          <w:sz w:val="18"/>
+          <w:szCs w:val="18"/>
+        </w:rPr>
+        <w:t xml:space="preserve">@theme inline { --color-espresso-800: #3B1F0A; }</w:t>
+      </w:r>
+    </w:p>
+    <w:p>
+      <w:pPr>
+        <w:spacing w:after="140"/>
+      </w:pPr>
+      <w:r>
+        <w:rPr>
+          <w:sz w:val="22"/>
+          <w:szCs w:val="22"/>
+        </w:rPr>
+        <w:t xml:space="preserve">Tailwind genereaza automat clasele utilitare (bg-espresso-800, text-espresso-800, hover:bg-espresso-900) din variabilele CSS definite in @theme.</w:t>
+      </w:r>
+    </w:p>
+    <w:p>
+      <w:pPr>
+        <w:pStyle w:val="Heading2"/>
+        <w:spacing w:after="160" w:before="320"/>
+      </w:pPr>
+      <w:r>
+        <w:rPr>
+          <w:b/>
+          <w:bCs/>
+          <w:color w:val="1F2937"/>
+          <w:sz w:val="26"/>
+          <w:szCs w:val="26"/>
+        </w:rPr>
+        <w:t xml:space="preserve">12.7 De ce Stepper (wizard) in loc de formular unic pe /rezervari?</w:t>
+      </w:r>
+    </w:p>
+    <w:p>
+      <w:pPr>
+        <w:spacing w:after="140"/>
+      </w:pPr>
+      <w:r>
+        <w:rPr>
+          <w:sz w:val="22"/>
+          <w:szCs w:val="22"/>
+        </w:rPr>
+        <w:t xml:space="preserve">Formularul de rezervare are 7 campuri. Un formular unic aglomerat poate descuraja utilizatorul (efect "wall of inputs"). Wizard-ul cu 3 pasi reduce cognitive load: utilizatorul vede maximum 2 campuri per pas si vede progresul vizual. Studiile UX arata ca formularele multi-pas au rate de completare mai bune pentru formulare complexe.</w:t>
       </w:r>
     </w:p>
     <w:p>

</xml_diff>